<commit_message>
Split Settings into main_setup and forms; fill invoices with docxtpl
The invoice pipeline no longer rewrites raw OOXML with regular expressions,
so templates that have been through Word are not corrupted. The template
editor opens Word explicitly and refuses a template whose invoice table has
been flattened. Adds a test suite and two development scripts.
</commit_message>
<xml_diff>
--- a/chronify/templates/Invoice_Template_TOKENS.docx
+++ b/chronify/templates/Invoice_Template_TOKENS.docx
@@ -1967,4 +1967,19 @@
   </a:objectDefaults>
   <a:extraClrSchemeLst/>
 </a:theme>
+</file>
+
+<file path=customXML/item1.xml><?xml version="1.0" encoding="utf-8"?>
+<go:gDocsCustomXmlDataStorage xmlns:go="http://customooxmlschemas.google.com/" xmlns:r="http://schemas.openxmlformats.org/officeDocument/2006/relationships" uri="GoogleDocsCustomDataVersion2">
+  <go:docsCustomData xmlns:go="http://customooxmlschemas.google.com/" roundtripDataSignature="AMtx7mgqqrNDfV15r3njVPgoXeMVEKtO7Q==">CgMxLjA4AHIhMU1jV1A2NHgzdC1jNmlZZmhpQzBwNWZPZ2NocXNaZ3R3</go:docsCustomData>
+</go:gDocsCustomXmlDataStorage>
+</file>
+
+<file path=customXML/itemProps1.xml><?xml version="1.0" encoding="utf-8"?>
+<ds:datastoreItem xmlns:ds="http://schemas.openxmlformats.org/officeDocument/2006/customXml" ds:itemID="{11111111-1234-1234-1234-123412341234}">
+  <ds:schemaRefs>
+    <ds:schemaRef ds:uri="http://schemas.openxmlformats.org/officeDocument/2006/relationships"/>
+    <ds:schemaRef ds:uri="http://customooxmlschemas.google.com/"/>
+  </ds:schemaRefs>
+</ds:datastoreItem>
 </file>
</xml_diff>